<commit_message>
Add CapEx talking points on Class-A saturation and temp control
Document DG regulation-driven returns, WH5 at 80-85% utilization vs
external lease, and Hellman visit raw-material temp needs; refresh Word packs.

Co-authored-by: jaykeyduo <jaykeyduo@users.noreply.github.com>
</commit_message>
<xml_diff>
--- a/deliverables/嘉兴仓储投资_决策一页纸_总经理.docx
+++ b/deliverables/嘉兴仓储投资_决策一页纸_总经理.docx
@@ -36,14 +36,14 @@
         <w:rPr>
           <w:rFonts w:ascii="微软雅黑" w:hAnsi="微软雅黑" w:eastAsia="微软雅黑"/>
           <w:b/>
-          <w:sz w:val="32"/>
+          <w:sz w:val="28"/>
         </w:rPr>
         <w:t>请决策</w:t>
       </w:r>
     </w:p>
     <w:p>
       <w:pPr>
-        <w:spacing w:after="120"/>
+        <w:spacing w:after="80"/>
       </w:pPr>
       <w:r>
         <w:rPr>
@@ -51,7 +51,7 @@
           <w:b/>
           <w:sz w:val="22"/>
         </w:rPr>
-        <w:t>批准按「一体 Program」推进；WP-A可启动采购准备；WP-B概算补齐后做金额终裁。</w:t>
+        <w:t>批准一体 Program：启动 WP-A 采购准备；WP-B 概算补齐后金额终裁。</w:t>
       </w:r>
     </w:p>
     <w:p>
@@ -62,7 +62,46 @@
         <w:rPr>
           <w:rFonts w:ascii="微软雅黑" w:hAnsi="微软雅黑" w:eastAsia="微软雅黑"/>
           <w:b/>
-          <w:sz w:val="32"/>
+          <w:sz w:val="28"/>
+        </w:rPr>
+        <w:t>投资前提（会上先讲）</w:t>
+      </w:r>
+    </w:p>
+    <w:p>
+      <w:pPr>
+        <w:spacing w:after="80"/>
+      </w:pPr>
+      <w:r>
+        <w:rPr>
+          <w:rFonts w:ascii="微软雅黑" w:hAnsi="微软雅黑" w:eastAsia="微软雅黑"/>
+          <w:b w:val="0"/>
+          <w:sz w:val="20"/>
+        </w:rPr>
+        <w:t>① 仓容：危化品存放法规要求使生产退运库存大增；5号甲类利用率已约80–85%。不投资则需外租甲类仓——增加租赁成本，且收发货更复杂、不利效率。对策：8号仓货架+VNA。</w:t>
+      </w:r>
+    </w:p>
+    <w:p>
+      <w:pPr>
+        <w:spacing w:after="80"/>
+      </w:pPr>
+      <w:r>
+        <w:rPr>
+          <w:rFonts w:ascii="微软雅黑" w:hAnsi="微软雅黑" w:eastAsia="微软雅黑"/>
+          <w:b w:val="0"/>
+          <w:sz w:val="20"/>
+        </w:rPr>
+        <w:t>② 温控：成品UV+水性漆需温控；德国Marcel Hellman考察亦指出大量原材料需温控。非温控仓已不符合国产化高标准工厂需求。对策：先做5号甲类温控试点。</w:t>
+      </w:r>
+    </w:p>
+    <w:p>
+      <w:pPr>
+        <w:pStyle w:val="Heading1"/>
+      </w:pPr>
+      <w:r>
+        <w:rPr>
+          <w:rFonts w:ascii="微软雅黑" w:hAnsi="微软雅黑" w:eastAsia="微软雅黑"/>
+          <w:b/>
+          <w:sz w:val="28"/>
         </w:rPr>
         <w:t>投什么</w:t>
       </w:r>
@@ -74,14 +113,14 @@
         <w:tblLook w:firstColumn="1" w:firstRow="1" w:lastColumn="0" w:lastRow="0" w:noHBand="0" w:noVBand="1" w:val="04A0"/>
       </w:tblPr>
       <w:tblGrid>
-        <w:gridCol w:w="3249"/>
-        <w:gridCol w:w="3249"/>
-        <w:gridCol w:w="3249"/>
+        <w:gridCol w:w="3324"/>
+        <w:gridCol w:w="3324"/>
+        <w:gridCol w:w="3324"/>
       </w:tblGrid>
       <w:tr>
         <w:tc>
           <w:tcPr>
-            <w:tcW w:type="dxa" w:w="3249"/>
+            <w:tcW w:type="dxa" w:w="3324"/>
           </w:tcPr>
           <w:p>
             <w:r>
@@ -96,7 +135,7 @@
         </w:tc>
         <w:tc>
           <w:tcPr>
-            <w:tcW w:type="dxa" w:w="3249"/>
+            <w:tcW w:type="dxa" w:w="3324"/>
           </w:tcPr>
           <w:p>
             <w:r>
@@ -111,7 +150,7 @@
         </w:tc>
         <w:tc>
           <w:tcPr>
-            <w:tcW w:type="dxa" w:w="3249"/>
+            <w:tcW w:type="dxa" w:w="3324"/>
           </w:tcPr>
           <w:p>
             <w:r>
@@ -128,7 +167,7 @@
       <w:tr>
         <w:tc>
           <w:tcPr>
-            <w:tcW w:type="dxa" w:w="3249"/>
+            <w:tcW w:type="dxa" w:w="3324"/>
           </w:tcPr>
           <w:p>
             <w:r>
@@ -143,7 +182,7 @@
         </w:tc>
         <w:tc>
           <w:tcPr>
-            <w:tcW w:type="dxa" w:w="3249"/>
+            <w:tcW w:type="dxa" w:w="3324"/>
           </w:tcPr>
           <w:p>
             <w:r>
@@ -158,7 +197,7 @@
         </w:tc>
         <w:tc>
           <w:tcPr>
-            <w:tcW w:type="dxa" w:w="3249"/>
+            <w:tcW w:type="dxa" w:w="3324"/>
           </w:tcPr>
           <w:p>
             <w:r>
@@ -167,7 +206,7 @@
                 <w:b w:val="0"/>
                 <w:sz w:val="20"/>
               </w:rPr>
-              <w:t>约210–230万（VNA≈200万 + 货架10–30万）</w:t>
+              <w:t>约210–230万</w:t>
             </w:r>
           </w:p>
         </w:tc>
@@ -175,7 +214,7 @@
       <w:tr>
         <w:tc>
           <w:tcPr>
-            <w:tcW w:type="dxa" w:w="3249"/>
+            <w:tcW w:type="dxa" w:w="3324"/>
           </w:tcPr>
           <w:p>
             <w:r>
@@ -190,7 +229,7 @@
         </w:tc>
         <w:tc>
           <w:tcPr>
-            <w:tcW w:type="dxa" w:w="3249"/>
+            <w:tcW w:type="dxa" w:w="3324"/>
           </w:tcPr>
           <w:p>
             <w:r>
@@ -205,7 +244,7 @@
         </w:tc>
         <w:tc>
           <w:tcPr>
-            <w:tcW w:type="dxa" w:w="3249"/>
+            <w:tcW w:type="dxa" w:w="3324"/>
           </w:tcPr>
           <w:p>
             <w:r>
@@ -229,14 +268,14 @@
         <w:rPr>
           <w:rFonts w:ascii="微软雅黑" w:hAnsi="微软雅黑" w:eastAsia="微软雅黑"/>
           <w:b/>
-          <w:sz w:val="32"/>
+          <w:sz w:val="28"/>
         </w:rPr>
-        <w:t>为什么</w:t>
+        <w:t>何时 / 谁来管</w:t>
       </w:r>
     </w:p>
     <w:p>
       <w:pPr>
-        <w:spacing w:after="120"/>
+        <w:spacing w:after="80"/>
       </w:pPr>
       <w:r>
         <w:rPr>
@@ -244,90 +283,25 @@
           <w:b w:val="0"/>
           <w:sz w:val="22"/>
         </w:rPr>
-        <w:t>独山仓为全国主枢纽（约80%货量）；危化品为主；UV/水性需5–35°C存贮；不能靠周六加班硬撑。8号仓提密度与效率，5号甲类先把温控做对。</w:t>
+        <w:t>投用：2027年中。小组：物流+工程+EHS+生产+财务。</w:t>
       </w:r>
     </w:p>
     <w:p>
       <w:pPr>
-        <w:pStyle w:val="Heading1"/>
+        <w:spacing w:after="80"/>
       </w:pPr>
       <w:r>
         <w:rPr>
           <w:rFonts w:ascii="微软雅黑" w:hAnsi="微软雅黑" w:eastAsia="微软雅黑"/>
           <w:b/>
-          <w:sz w:val="32"/>
+          <w:sz w:val="20"/>
         </w:rPr>
-        <w:t>何时 / 谁来管</w:t>
-      </w:r>
-    </w:p>
-    <w:p>
-      <w:pPr>
-        <w:spacing w:after="120"/>
-      </w:pPr>
-      <w:r>
-        <w:rPr>
-          <w:rFonts w:ascii="微软雅黑" w:hAnsi="微软雅黑" w:eastAsia="微软雅黑"/>
-          <w:b w:val="0"/>
-          <w:sz w:val="22"/>
-        </w:rPr>
-        <w:t>投用窗口：2027年中。联合小组：物流（业主）+工程+EHS+生产+财务。</w:t>
-      </w:r>
-    </w:p>
-    <w:p>
-      <w:pPr>
-        <w:pStyle w:val="Heading1"/>
-      </w:pPr>
-      <w:r>
-        <w:rPr>
-          <w:rFonts w:ascii="微软雅黑" w:hAnsi="微软雅黑" w:eastAsia="微软雅黑"/>
-          <w:b/>
-          <w:sz w:val="32"/>
-        </w:rPr>
-        <w:t>明确不承诺</w:t>
-      </w:r>
-    </w:p>
-    <w:p>
-      <w:pPr>
-        <w:spacing w:after="120"/>
-      </w:pPr>
-      <w:r>
-        <w:rPr>
-          <w:rFonts w:ascii="微软雅黑" w:hAnsi="微软雅黑" w:eastAsia="微软雅黑"/>
-          <w:b w:val="0"/>
-          <w:sz w:val="22"/>
-        </w:rPr>
-        <w:t>乙类仓温控本期不铺开；出口/储罐等另案。</w:t>
-      </w:r>
-    </w:p>
-    <w:p>
-      <w:pPr>
-        <w:pStyle w:val="Heading1"/>
-      </w:pPr>
-      <w:r>
-        <w:rPr>
-          <w:rFonts w:ascii="微软雅黑" w:hAnsi="微软雅黑" w:eastAsia="微软雅黑"/>
-          <w:b/>
-          <w:sz w:val="32"/>
-        </w:rPr>
-        <w:t>待补后终裁</w:t>
-      </w:r>
-    </w:p>
-    <w:p>
-      <w:pPr>
-        <w:spacing w:after="120"/>
-      </w:pPr>
-      <w:r>
-        <w:rPr>
-          <w:rFonts w:ascii="微软雅黑" w:hAnsi="微软雅黑" w:eastAsia="微软雅黑"/>
-          <w:b w:val="0"/>
-          <w:sz w:val="22"/>
-        </w:rPr>
-        <w:t>温控概算、货架合同价、VNA型号交期、甲类EHS路径。</w:t>
+        <w:t>对比一句话：外租=持续花钱+流程复杂；厂内投资=能力留在工厂。</w:t>
       </w:r>
     </w:p>
     <w:sectPr>
       <w:pgSz w:w="12240" w:h="15840"/>
-      <w:pgMar w:top="1134" w:right="1247" w:bottom="1134" w:left="1247" w:header="720" w:footer="720" w:gutter="0"/>
+      <w:pgMar w:top="1020" w:right="1134" w:bottom="1020" w:left="1134" w:header="720" w:footer="720" w:gutter="0"/>
       <w:cols w:space="720"/>
       <w:docGrid w:linePitch="360"/>
     </w:sectPr>

</xml_diff>